<commit_message>
Respaldo local antes de forzar subida
</commit_message>
<xml_diff>
--- a/Casos de Prueba en Gherkin/Caso de Prueba en Gherkin.docx
+++ b/Casos de Prueba en Gherkin/Caso de Prueba en Gherkin.docx
@@ -11,28 +11,14 @@
           <w:lang w:eastAsia="es-VE"/>
         </w:rPr>
       </w:pPr>
+      <w:bookmarkStart w:id="0" w:name="_GoBack"/>
+      <w:bookmarkEnd w:id="0"/>
       <w:r>
         <w:rPr>
           <w:rFonts w:eastAsia="Times New Roman"/>
           <w:lang w:eastAsia="es-VE"/>
         </w:rPr>
-        <w:t xml:space="preserve"># </w:t>
-      </w:r>
-      <w:bookmarkStart w:id="0" w:name="_GoBack"/>
-      <w:r>
-        <w:rPr>
-          <w:rFonts w:eastAsia="Times New Roman"/>
-          <w:lang w:eastAsia="es-VE"/>
-        </w:rPr>
-        <w:t xml:space="preserve">Caso de Prueba del </w:t>
-      </w:r>
-      <w:bookmarkEnd w:id="0"/>
-      <w:r>
-        <w:rPr>
-          <w:rFonts w:eastAsia="Times New Roman"/>
-          <w:lang w:eastAsia="es-VE"/>
-        </w:rPr>
-        <w:t>sistema Home Banking Web Application v3.0</w:t>
+        <w:t># Caso de Prueba del sistema Home Banking Web Application v3.0</w:t>
       </w:r>
     </w:p>
     <w:p>

</xml_diff>